<commit_message>
Add Or Hadari's first interview, resolve his identity, update summary skill defaults
- Summarize Or Hadari's earlier interview (Ayta, the Bint Jbeil kasbah,
  and a friendly-fire incident) — chronologically his first, despite the
  transcript filename carrying a "002" suffix.
- Correct the identity note in the previously-summarized "Adari" interview
  now that this second interview settles it: the name is Or Hadari.
- Update Tools/01-skills/summarize-interview.md to default to fewer,
  longer timestamped entries, reversing the original "more, shorter
  entries" guidance, per three consecutive requests for this.
- Log the identity-resolution and filename-numbering findings, and the
  skill-default change, in learning log / decisions / essentials.
</commit_message>
<xml_diff>
--- a/Brain/05-Interviews/Season2-Lebanon/summaries/סיכום ראיון אדרי - מפ רובאית.docx
+++ b/Brain/05-Interviews/Season2-Lebanon/summaries/סיכום ראיון אדרי - מפ רובאית.docx
@@ -24,28 +24,28 @@
           <w:b w:val="0"/>
           <w:rtl w:val="1"/>
         </w:rPr>
-        <w:t>הערת זיהוי:</w:t>
+        <w:t>הערת זיהוי — עודכן:</w:t>
       </w:r>
       <w:r>
         <w:rPr>
           <w:b/>
           <w:rtl w:val="1"/>
         </w:rPr>
-        <w:t xml:space="preserve"> בקובץ עצמו המרואיין מזהה את עצמו כ</w:t>
+        <w:t xml:space="preserve"> מאומת מול ראיון נפרד של אותו מרואיין (שם עצמי ברור פעמיים: "אור הדרי, מ"פ רובאית, גדוד שקד") — השם הנכון הוא </w:t>
       </w:r>
       <w:r>
         <w:rPr>
           <w:b w:val="0"/>
           <w:rtl w:val="1"/>
         </w:rPr>
-        <w:t>"הדרי מאפולה"</w:t>
+        <w:t>אור הדרי</w:t>
       </w:r>
       <w:r>
         <w:rPr>
           <w:b/>
           <w:rtl w:val="1"/>
         </w:rPr>
-        <w:t xml:space="preserve"> (6:59-7:14) — ייתכן שזו ההגייה הנכונה ולא "אדרי" (בלבול נפוץ של ASR בין א' ל-ה'). נשמר שם הקובץ "אדרי" בהתאם לשם שניתן, אך מומלץ לאמת מול ההפקה.</w:t>
+        <w:t>, לא "אדרי". שם הקובץ הזה נשאר כפי שנוצר במקור כדי לא לשבור הפניות קיימות; הקובץ המתוקן/החדש נקרא "סיכום ראיון אור הדרי - מפ רובאית (ראיון 1 - עיינתא ובינת גבל)".</w:t>
       </w:r>
     </w:p>
     <w:p>

</xml_diff>